<commit_message>
feat(html): a document's stylesheet styles its content
The rules of a page's own <style> elements whose selectors name a class
or an id (with types, and descendant and child combinators) reach the
elements they select, under each element's own style; a rule for every
element of a type is the page's theme and is left out. The colour in a
background shorthand is read, and a var() colour is no colour. HTML
output marks its stylesheet as the writer's defaults (data-default-styles),
which reading it back leaves out.
</commit_message>
<xml_diff>
--- a/test/generator/baseline/gen.html.to.docx.docx
+++ b/test/generator/baseline/gen.html.to.docx.docx
@@ -2717,9 +2717,13 @@
       </w:r>
     </w:p>
     <w:p>
+      <w:pPr>
+        <w:spacing w:after="192"/>
+      </w:pPr>
       <w:r>
         <w:rPr>
           <w:sz w:val="20"/>
+          <w:shd w:val="clear" w:color="auto" w:fill="FDFDFD"/>
         </w:rPr>
         <w:t xml:space="preserve">In paged media, footnotes are usually displayed at the bottom of the text. However, in ebooks, a better paradigm is to make them clickable endnotes that the user can browse at her pleasure. This conversion is handled automatically by calibre.</w:t>
       </w:r>
@@ -2730,9 +2734,13 @@
       </w:r>
     </w:p>
     <w:p>
+      <w:pPr>
+        <w:spacing w:after="192"/>
+      </w:pPr>
       <w:r>
         <w:rPr>
           <w:sz w:val="20"/>
+          <w:shd w:val="clear" w:color="auto" w:fill="FDFDFD"/>
         </w:rPr>
         <w:t xml:space="preserve">Endnotes are typically used for longer notes, they remain endnotes when converted into ebook form, except that they have an additional backlink to make it easy to return to the current position after reading the note.</w:t>
       </w:r>

</xml_diff>